<commit_message>
New death sentence exerpts and updated lists
</commit_message>
<xml_diff>
--- a/docs/BYYEAR/Расстреляны_1935.docx
+++ b/docs/BYYEAR/Расстреляны_1935.docx
@@ -68,6 +68,17 @@
           <w:lang w:val="ru-RU"/>
         </w:rPr>
         <w:t xml:space="preserve"> </w:t>
+      </w:r>
+      <w:r>
+        <w:rPr>
+          <w:rFonts w:ascii="Arial" w:hAnsi="Arial" w:cs="Arial"/>
+          <w:b/>
+          <w:bCs/>
+          <w:sz w:val="18"/>
+          <w:szCs w:val="18"/>
+          <w:lang w:val="ru-RU"/>
+        </w:rPr>
+        <w:t xml:space="preserve">В СССР </w:t>
       </w:r>
       <w:r>
         <w:rPr>

</xml_diff>